<commit_message>
Opening With Matthew by using Fungus
only fungus txt
no any animation
</commit_message>
<xml_diff>
--- a/劇本.docx
+++ b/劇本.docx
@@ -80,7 +80,7 @@
       <w:pPr>
         <w:spacing w:line="240" w:lineRule="auto"/>
         <w:rPr>
-          <w:rFonts w:ascii="Times New Roman" w:eastAsia="PMingLiU" w:hAnsi="Times New Roman" w:cs="Times New Roman" w:hint="eastAsia"/>
+          <w:rFonts w:ascii="Times New Roman" w:eastAsia="PMingLiU" w:hAnsi="Times New Roman" w:cs="Times New Roman"/>
           <w:sz w:val="24"/>
           <w:lang w:eastAsia="zh-TW"/>
         </w:rPr>
@@ -197,7 +197,39 @@
           <w:sz w:val="24"/>
           <w:lang w:eastAsia="zh-TW"/>
         </w:rPr>
-        <w:t>關掉</w:t>
+        <w:t>關掉鬧鐘。</w:t>
+      </w:r>
+      <w:r>
+        <w:rPr>
+          <w:rFonts w:ascii="Times New Roman" w:eastAsia="PMingLiU" w:hAnsi="Times New Roman" w:cs="Times New Roman" w:hint="eastAsia"/>
+          <w:sz w:val="24"/>
+          <w:lang w:eastAsia="zh-TW"/>
+        </w:rPr>
+        <w:t>(</w:t>
+      </w:r>
+      <w:r>
+        <w:rPr>
+          <w:rFonts w:ascii="Times New Roman" w:eastAsia="PMingLiU" w:hAnsi="Times New Roman" w:cs="Times New Roman" w:hint="eastAsia"/>
+          <w:sz w:val="24"/>
+          <w:lang w:eastAsia="zh-TW"/>
+        </w:rPr>
+        <w:t>背景音</w:t>
+      </w:r>
+      <w:r>
+        <w:rPr>
+          <w:rFonts w:ascii="Times New Roman" w:eastAsia="PMingLiU" w:hAnsi="Times New Roman" w:cs="Times New Roman" w:hint="eastAsia"/>
+          <w:sz w:val="24"/>
+          <w:lang w:eastAsia="zh-TW"/>
+        </w:rPr>
+        <w:t>:</w:t>
+      </w:r>
+      <w:r>
+        <w:rPr>
+          <w:rFonts w:ascii="Times New Roman" w:eastAsia="PMingLiU" w:hAnsi="Times New Roman" w:cs="Times New Roman"/>
+          <w:sz w:val="24"/>
+          <w:lang w:eastAsia="zh-TW"/>
+        </w:rPr>
+        <w:t xml:space="preserve"> </w:t>
       </w:r>
       <w:r>
         <w:rPr>
@@ -213,7 +245,49 @@
           <w:sz w:val="24"/>
           <w:lang w:eastAsia="zh-TW"/>
         </w:rPr>
-        <w:t>。</w:t>
+        <w:t>o</w:t>
+      </w:r>
+      <w:r>
+        <w:rPr>
+          <w:rFonts w:ascii="Times New Roman" w:eastAsia="PMingLiU" w:hAnsi="Times New Roman" w:cs="Times New Roman"/>
+          <w:sz w:val="24"/>
+          <w:lang w:eastAsia="zh-TW"/>
+        </w:rPr>
+        <w:t>n to off)</w:t>
+      </w:r>
+    </w:p>
+    <w:p>
+      <w:pPr>
+        <w:spacing w:line="240" w:lineRule="auto"/>
+        <w:rPr>
+          <w:rFonts w:ascii="Times New Roman" w:eastAsia="PMingLiU" w:hAnsi="Times New Roman" w:cs="Times New Roman"/>
+          <w:sz w:val="24"/>
+          <w:lang w:eastAsia="zh-TW"/>
+        </w:rPr>
+      </w:pPr>
+      <w:r>
+        <w:rPr>
+          <w:rFonts w:ascii="Times New Roman" w:eastAsia="PMingLiU" w:hAnsi="Times New Roman" w:cs="Times New Roman"/>
+          <w:sz w:val="24"/>
+          <w:lang w:eastAsia="zh-TW"/>
+        </w:rPr>
+        <w:t>M</w:t>
+      </w:r>
+      <w:r>
+        <w:rPr>
+          <w:rFonts w:ascii="Times New Roman" w:eastAsia="PMingLiU" w:hAnsi="Times New Roman" w:cs="Times New Roman" w:hint="eastAsia"/>
+          <w:sz w:val="24"/>
+          <w:lang w:eastAsia="zh-TW"/>
+        </w:rPr>
+        <w:t>a</w:t>
+      </w:r>
+      <w:r>
+        <w:rPr>
+          <w:rFonts w:ascii="Times New Roman" w:eastAsia="PMingLiU" w:hAnsi="Times New Roman" w:cs="Times New Roman"/>
+          <w:sz w:val="24"/>
+          <w:lang w:eastAsia="zh-TW"/>
+        </w:rPr>
+        <w:t>tthew</w:t>
       </w:r>
       <w:r>
         <w:rPr>
@@ -229,7 +303,23 @@
           <w:sz w:val="24"/>
           <w:lang w:eastAsia="zh-TW"/>
         </w:rPr>
-        <w:t>背景音</w:t>
+        <w:t>出現</w:t>
+      </w:r>
+      <w:r>
+        <w:rPr>
+          <w:rFonts w:ascii="Times New Roman" w:eastAsia="PMingLiU" w:hAnsi="Times New Roman" w:cs="Times New Roman" w:hint="eastAsia"/>
+          <w:sz w:val="24"/>
+          <w:lang w:eastAsia="zh-TW"/>
+        </w:rPr>
+        <w:t>對話框</w:t>
+      </w:r>
+      <w:r>
+        <w:rPr>
+          <w:rFonts w:ascii="Times New Roman" w:eastAsia="PMingLiU" w:hAnsi="Times New Roman" w:cs="Times New Roman"/>
+          <w:sz w:val="24"/>
+          <w:lang w:eastAsia="zh-TW"/>
+        </w:rPr>
+        <w:t>)</w:t>
       </w:r>
       <w:r>
         <w:rPr>
@@ -253,23 +343,7 @@
           <w:sz w:val="24"/>
           <w:lang w:eastAsia="zh-TW"/>
         </w:rPr>
-        <w:t>鬧鐘</w:t>
-      </w:r>
-      <w:r>
-        <w:rPr>
-          <w:rFonts w:ascii="Times New Roman" w:eastAsia="PMingLiU" w:hAnsi="Times New Roman" w:cs="Times New Roman" w:hint="eastAsia"/>
-          <w:sz w:val="24"/>
-          <w:lang w:eastAsia="zh-TW"/>
-        </w:rPr>
-        <w:t>o</w:t>
-      </w:r>
-      <w:r>
-        <w:rPr>
-          <w:rFonts w:ascii="Times New Roman" w:eastAsia="PMingLiU" w:hAnsi="Times New Roman" w:cs="Times New Roman"/>
-          <w:sz w:val="24"/>
-          <w:lang w:eastAsia="zh-TW"/>
-        </w:rPr>
-        <w:t>n to off)</w:t>
+        <w:t>熟悉的天花板，又係返工賺錢的一日。</w:t>
       </w:r>
     </w:p>
     <w:p>
@@ -281,33 +355,129 @@
           <w:lang w:eastAsia="zh-TW"/>
         </w:rPr>
       </w:pPr>
-      <w:r>
-        <w:rPr>
-          <w:rFonts w:ascii="Times New Roman" w:eastAsia="PMingLiU" w:hAnsi="Times New Roman" w:cs="Times New Roman"/>
-          <w:sz w:val="24"/>
-          <w:lang w:eastAsia="zh-TW"/>
-        </w:rPr>
-        <w:t>M</w:t>
-      </w:r>
-      <w:r>
-        <w:rPr>
-          <w:rFonts w:ascii="Times New Roman" w:eastAsia="PMingLiU" w:hAnsi="Times New Roman" w:cs="Times New Roman" w:hint="eastAsia"/>
-          <w:sz w:val="24"/>
-          <w:lang w:eastAsia="zh-TW"/>
-        </w:rPr>
-        <w:t>a</w:t>
-      </w:r>
-      <w:r>
-        <w:rPr>
-          <w:rFonts w:ascii="Times New Roman" w:eastAsia="PMingLiU" w:hAnsi="Times New Roman" w:cs="Times New Roman"/>
-          <w:sz w:val="24"/>
-          <w:lang w:eastAsia="zh-TW"/>
-        </w:rPr>
-        <w:t>tthew</w:t>
-      </w:r>
-      <w:r>
-        <w:rPr>
-          <w:rFonts w:ascii="Times New Roman" w:eastAsia="PMingLiU" w:hAnsi="Times New Roman" w:cs="Times New Roman" w:hint="eastAsia"/>
+    </w:p>
+    <w:p>
+      <w:pPr>
+        <w:spacing w:line="240" w:lineRule="auto"/>
+        <w:rPr>
+          <w:rFonts w:ascii="Times New Roman" w:eastAsia="PMingLiU" w:hAnsi="Times New Roman" w:cs="Times New Roman"/>
+          <w:sz w:val="24"/>
+          <w:lang w:eastAsia="zh-TW"/>
+        </w:rPr>
+      </w:pPr>
+      <w:r>
+        <w:rPr>
+          <w:rFonts w:ascii="Times New Roman" w:hAnsi="Times New Roman" w:cs="Times New Roman"/>
+          <w:sz w:val="24"/>
+          <w:lang w:eastAsia="zh-TW"/>
+        </w:rPr>
+        <w:t>&lt;</w:t>
+      </w:r>
+      <w:r>
+        <w:rPr>
+          <w:rFonts w:ascii="PMingLiU" w:eastAsia="PMingLiU" w:hAnsi="PMingLiU" w:cs="Times New Roman" w:hint="eastAsia"/>
+          <w:sz w:val="24"/>
+          <w:lang w:eastAsia="zh-TW"/>
+        </w:rPr>
+        <w:t>外景</w:t>
+      </w:r>
+      <w:r>
+        <w:rPr>
+          <w:rFonts w:ascii="Times New Roman" w:hAnsi="Times New Roman" w:cs="Times New Roman"/>
+          <w:sz w:val="24"/>
+          <w:lang w:eastAsia="zh-TW"/>
+        </w:rPr>
+        <w:t xml:space="preserve">&gt; </w:t>
+      </w:r>
+      <w:r>
+        <w:rPr>
+          <w:rFonts w:ascii="PMingLiU" w:eastAsia="PMingLiU" w:hAnsi="PMingLiU" w:cs="Times New Roman" w:hint="eastAsia"/>
+          <w:sz w:val="24"/>
+          <w:lang w:eastAsia="zh-TW"/>
+        </w:rPr>
+        <w:t>倉庫外 早上</w:t>
+      </w:r>
+    </w:p>
+    <w:p>
+      <w:pPr>
+        <w:spacing w:line="240" w:lineRule="auto"/>
+        <w:rPr>
+          <w:rFonts w:ascii="Times New Roman" w:eastAsia="PMingLiU" w:hAnsi="Times New Roman" w:cs="Times New Roman"/>
+          <w:sz w:val="24"/>
+          <w:lang w:eastAsia="zh-TW"/>
+        </w:rPr>
+      </w:pPr>
+      <w:r>
+        <w:rPr>
+          <w:rFonts w:ascii="Times New Roman" w:eastAsia="PMingLiU" w:hAnsi="Times New Roman" w:cs="Times New Roman" w:hint="eastAsia"/>
+          <w:sz w:val="24"/>
+          <w:lang w:eastAsia="zh-TW"/>
+        </w:rPr>
+        <w:t>畫面</w:t>
+      </w:r>
+      <w:r>
+        <w:rPr>
+          <w:rFonts w:ascii="Times New Roman" w:eastAsia="PMingLiU" w:hAnsi="Times New Roman" w:cs="Times New Roman" w:hint="eastAsia"/>
+          <w:sz w:val="24"/>
+          <w:lang w:eastAsia="zh-TW"/>
+        </w:rPr>
+        <w:t>:</w:t>
+      </w:r>
+      <w:r>
+        <w:rPr>
+          <w:rFonts w:ascii="Times New Roman" w:eastAsia="PMingLiU" w:hAnsi="Times New Roman" w:cs="Times New Roman"/>
+          <w:sz w:val="24"/>
+          <w:lang w:eastAsia="zh-TW"/>
+        </w:rPr>
+        <w:t xml:space="preserve"> </w:t>
+      </w:r>
+      <w:r>
+        <w:rPr>
+          <w:rFonts w:ascii="Times New Roman" w:eastAsia="PMingLiU" w:hAnsi="Times New Roman" w:cs="Times New Roman" w:hint="eastAsia"/>
+          <w:sz w:val="24"/>
+          <w:lang w:eastAsia="zh-TW"/>
+        </w:rPr>
+        <w:t>倉庫外</w:t>
+      </w:r>
+      <w:r>
+        <w:rPr>
+          <w:rFonts w:ascii="Times New Roman" w:eastAsia="PMingLiU" w:hAnsi="Times New Roman" w:cs="Times New Roman" w:hint="eastAsia"/>
+          <w:sz w:val="24"/>
+          <w:lang w:eastAsia="zh-TW"/>
+        </w:rPr>
+        <w:t xml:space="preserve"> </w:t>
+      </w:r>
+      <w:r>
+        <w:rPr>
+          <w:rFonts w:ascii="Times New Roman" w:eastAsia="PMingLiU" w:hAnsi="Times New Roman" w:cs="Times New Roman" w:hint="eastAsia"/>
+          <w:sz w:val="24"/>
+          <w:lang w:eastAsia="zh-TW"/>
+        </w:rPr>
+        <w:t>車</w:t>
+      </w:r>
+    </w:p>
+    <w:p>
+      <w:pPr>
+        <w:spacing w:line="240" w:lineRule="auto"/>
+        <w:rPr>
+          <w:rFonts w:ascii="Times New Roman" w:eastAsia="PMingLiU" w:hAnsi="Times New Roman" w:cs="Times New Roman"/>
+          <w:strike/>
+          <w:sz w:val="24"/>
+          <w:lang w:eastAsia="zh-TW"/>
+        </w:rPr>
+      </w:pPr>
+      <w:r>
+        <w:rPr>
+          <w:rFonts w:ascii="Times New Roman" w:eastAsia="PMingLiU" w:hAnsi="Times New Roman" w:cs="Times New Roman" w:hint="eastAsia"/>
+          <w:sz w:val="24"/>
+          <w:lang w:eastAsia="zh-TW"/>
+        </w:rPr>
+        <w:t>麵包車駛入</w:t>
+      </w:r>
+      <w:r>
+        <w:rPr>
+          <w:rFonts w:ascii="Times New Roman" w:eastAsia="PMingLiU" w:hAnsi="Times New Roman" w:cs="Times New Roman" w:hint="eastAsia"/>
+          <w:strike/>
           <w:sz w:val="24"/>
           <w:lang w:eastAsia="zh-TW"/>
         </w:rPr>
@@ -316,22 +486,16 @@
       <w:r>
         <w:rPr>
           <w:rFonts w:ascii="Times New Roman" w:eastAsia="PMingLiU" w:hAnsi="Times New Roman" w:cs="Times New Roman" w:hint="eastAsia"/>
-          <w:sz w:val="24"/>
-          <w:lang w:eastAsia="zh-TW"/>
-        </w:rPr>
-        <w:t>出現</w:t>
-      </w:r>
-      <w:r>
-        <w:rPr>
-          <w:rFonts w:ascii="Times New Roman" w:eastAsia="PMingLiU" w:hAnsi="Times New Roman" w:cs="Times New Roman" w:hint="eastAsia"/>
-          <w:sz w:val="24"/>
-          <w:lang w:eastAsia="zh-TW"/>
-        </w:rPr>
-        <w:t>對話框</w:t>
-      </w:r>
-      <w:r>
-        <w:rPr>
-          <w:rFonts w:ascii="Times New Roman" w:eastAsia="PMingLiU" w:hAnsi="Times New Roman" w:cs="Times New Roman"/>
+          <w:strike/>
+          <w:sz w:val="24"/>
+          <w:lang w:eastAsia="zh-TW"/>
+        </w:rPr>
+        <w:t>飄移</w:t>
+      </w:r>
+      <w:r>
+        <w:rPr>
+          <w:rFonts w:ascii="Times New Roman" w:eastAsia="PMingLiU" w:hAnsi="Times New Roman" w:cs="Times New Roman"/>
+          <w:strike/>
           <w:sz w:val="24"/>
           <w:lang w:eastAsia="zh-TW"/>
         </w:rPr>
@@ -343,23 +507,42 @@
           <w:sz w:val="24"/>
           <w:lang w:eastAsia="zh-TW"/>
         </w:rPr>
-        <w:t>:</w:t>
-      </w:r>
-      <w:r>
-        <w:rPr>
-          <w:rFonts w:ascii="Times New Roman" w:eastAsia="PMingLiU" w:hAnsi="Times New Roman" w:cs="Times New Roman"/>
-          <w:sz w:val="24"/>
-          <w:lang w:eastAsia="zh-TW"/>
-        </w:rPr>
-        <w:t xml:space="preserve"> </w:t>
-      </w:r>
-      <w:r>
-        <w:rPr>
-          <w:rFonts w:ascii="Times New Roman" w:eastAsia="PMingLiU" w:hAnsi="Times New Roman" w:cs="Times New Roman" w:hint="eastAsia"/>
-          <w:sz w:val="24"/>
-          <w:lang w:eastAsia="zh-TW"/>
-        </w:rPr>
-        <w:t>熟悉的天花板，又係返工賺錢的一日。</w:t>
+        <w:t>倉庫</w:t>
+      </w:r>
+      <w:r>
+        <w:rPr>
+          <w:rFonts w:ascii="Times New Roman" w:eastAsia="PMingLiU" w:hAnsi="Times New Roman" w:cs="Times New Roman" w:hint="eastAsia"/>
+          <w:sz w:val="24"/>
+          <w:lang w:eastAsia="zh-TW"/>
+        </w:rPr>
+        <w:t>，</w:t>
+      </w:r>
+      <w:r>
+        <w:rPr>
+          <w:rFonts w:ascii="Times New Roman" w:eastAsia="PMingLiU" w:hAnsi="Times New Roman" w:cs="Times New Roman" w:hint="eastAsia"/>
+          <w:strike/>
+          <w:sz w:val="24"/>
+          <w:lang w:eastAsia="zh-TW"/>
+        </w:rPr>
+        <w:t>兩位</w:t>
+      </w:r>
+      <w:r>
+        <w:rPr>
+          <w:rFonts w:ascii="Times New Roman" w:eastAsia="PMingLiU" w:hAnsi="Times New Roman" w:cs="Times New Roman" w:hint="eastAsia"/>
+          <w:strike/>
+          <w:sz w:val="24"/>
+          <w:lang w:eastAsia="zh-TW"/>
+        </w:rPr>
+        <w:t>穿</w:t>
+      </w:r>
+      <w:r>
+        <w:rPr>
+          <w:rFonts w:ascii="Times New Roman" w:eastAsia="PMingLiU" w:hAnsi="Times New Roman" w:cs="Times New Roman" w:hint="eastAsia"/>
+          <w:strike/>
+          <w:sz w:val="24"/>
+          <w:lang w:eastAsia="zh-TW"/>
+        </w:rPr>
+        <w:t>著工作服的員工從駕駛室下來，打開了麵包車的尾門。</w:t>
       </w:r>
     </w:p>
     <w:p>
@@ -374,6 +557,23 @@
     </w:p>
     <w:p>
       <w:pPr>
+        <w:rPr>
+          <w:rFonts w:ascii="Times New Roman" w:eastAsia="PMingLiU" w:hAnsi="Times New Roman" w:cs="Times New Roman"/>
+          <w:sz w:val="24"/>
+          <w:lang w:eastAsia="zh-TW"/>
+        </w:rPr>
+      </w:pPr>
+      <w:r>
+        <w:rPr>
+          <w:rFonts w:ascii="Times New Roman" w:eastAsia="PMingLiU" w:hAnsi="Times New Roman" w:cs="Times New Roman"/>
+          <w:sz w:val="24"/>
+          <w:lang w:eastAsia="zh-TW"/>
+        </w:rPr>
+        <w:br w:type="page"/>
+      </w:r>
+    </w:p>
+    <w:p>
+      <w:pPr>
         <w:spacing w:line="240" w:lineRule="auto"/>
         <w:rPr>
           <w:rFonts w:ascii="Times New Roman" w:eastAsia="PMingLiU" w:hAnsi="Times New Roman" w:cs="Times New Roman"/>
@@ -381,45 +581,22 @@
           <w:lang w:eastAsia="zh-TW"/>
         </w:rPr>
       </w:pPr>
-      <w:r>
-        <w:rPr>
-          <w:rFonts w:ascii="Times New Roman" w:hAnsi="Times New Roman" w:cs="Times New Roman"/>
-          <w:sz w:val="24"/>
-          <w:lang w:eastAsia="zh-TW"/>
-        </w:rPr>
-        <w:t>&lt;</w:t>
-      </w:r>
-      <w:r>
-        <w:rPr>
-          <w:rFonts w:ascii="PMingLiU" w:eastAsia="PMingLiU" w:hAnsi="PMingLiU" w:cs="Times New Roman" w:hint="eastAsia"/>
-          <w:sz w:val="24"/>
-          <w:lang w:eastAsia="zh-TW"/>
-        </w:rPr>
-        <w:t>外</w:t>
-      </w:r>
-      <w:r>
-        <w:rPr>
-          <w:rFonts w:ascii="PMingLiU" w:eastAsia="PMingLiU" w:hAnsi="PMingLiU" w:cs="Times New Roman" w:hint="eastAsia"/>
-          <w:sz w:val="24"/>
-          <w:lang w:eastAsia="zh-TW"/>
-        </w:rPr>
-        <w:t>景</w:t>
-      </w:r>
-      <w:r>
-        <w:rPr>
-          <w:rFonts w:ascii="Times New Roman" w:hAnsi="Times New Roman" w:cs="Times New Roman"/>
-          <w:sz w:val="24"/>
-          <w:lang w:eastAsia="zh-TW"/>
-        </w:rPr>
-        <w:t xml:space="preserve">&gt; </w:t>
-      </w:r>
-      <w:r>
-        <w:rPr>
-          <w:rFonts w:ascii="PMingLiU" w:eastAsia="PMingLiU" w:hAnsi="PMingLiU" w:cs="Times New Roman" w:hint="eastAsia"/>
-          <w:sz w:val="24"/>
-          <w:lang w:eastAsia="zh-TW"/>
-        </w:rPr>
-        <w:t>倉庫外 早上</w:t>
+    </w:p>
+    <w:p>
+      <w:pPr>
+        <w:rPr>
+          <w:rFonts w:ascii="Times New Roman" w:eastAsia="PMingLiU" w:hAnsi="Times New Roman" w:cs="Times New Roman"/>
+          <w:sz w:val="24"/>
+          <w:lang w:eastAsia="zh-TW"/>
+        </w:rPr>
+      </w:pPr>
+      <w:r>
+        <w:rPr>
+          <w:rFonts w:ascii="Times New Roman" w:eastAsia="PMingLiU" w:hAnsi="Times New Roman" w:cs="Times New Roman"/>
+          <w:sz w:val="24"/>
+          <w:lang w:eastAsia="zh-TW"/>
+        </w:rPr>
+        <w:br w:type="page"/>
       </w:r>
     </w:p>
     <w:p>
@@ -427,203 +604,6 @@
         <w:spacing w:line="240" w:lineRule="auto"/>
         <w:rPr>
           <w:rFonts w:ascii="Times New Roman" w:eastAsia="PMingLiU" w:hAnsi="Times New Roman" w:cs="Times New Roman"/>
-          <w:sz w:val="24"/>
-          <w:lang w:eastAsia="zh-TW"/>
-        </w:rPr>
-      </w:pPr>
-      <w:r>
-        <w:rPr>
-          <w:rFonts w:ascii="Times New Roman" w:eastAsia="PMingLiU" w:hAnsi="Times New Roman" w:cs="Times New Roman" w:hint="eastAsia"/>
-          <w:sz w:val="24"/>
-          <w:lang w:eastAsia="zh-TW"/>
-        </w:rPr>
-        <w:t>畫面</w:t>
-      </w:r>
-      <w:r>
-        <w:rPr>
-          <w:rFonts w:ascii="Times New Roman" w:eastAsia="PMingLiU" w:hAnsi="Times New Roman" w:cs="Times New Roman" w:hint="eastAsia"/>
-          <w:sz w:val="24"/>
-          <w:lang w:eastAsia="zh-TW"/>
-        </w:rPr>
-        <w:t>:</w:t>
-      </w:r>
-      <w:r>
-        <w:rPr>
-          <w:rFonts w:ascii="Times New Roman" w:eastAsia="PMingLiU" w:hAnsi="Times New Roman" w:cs="Times New Roman"/>
-          <w:sz w:val="24"/>
-          <w:lang w:eastAsia="zh-TW"/>
-        </w:rPr>
-        <w:t xml:space="preserve"> </w:t>
-      </w:r>
-      <w:r>
-        <w:rPr>
-          <w:rFonts w:ascii="Times New Roman" w:eastAsia="PMingLiU" w:hAnsi="Times New Roman" w:cs="Times New Roman" w:hint="eastAsia"/>
-          <w:sz w:val="24"/>
-          <w:lang w:eastAsia="zh-TW"/>
-        </w:rPr>
-        <w:t>倉庫外</w:t>
-      </w:r>
-      <w:r>
-        <w:rPr>
-          <w:rFonts w:ascii="Times New Roman" w:eastAsia="PMingLiU" w:hAnsi="Times New Roman" w:cs="Times New Roman" w:hint="eastAsia"/>
-          <w:sz w:val="24"/>
-          <w:lang w:eastAsia="zh-TW"/>
-        </w:rPr>
-        <w:t xml:space="preserve"> </w:t>
-      </w:r>
-      <w:r>
-        <w:rPr>
-          <w:rFonts w:ascii="Times New Roman" w:eastAsia="PMingLiU" w:hAnsi="Times New Roman" w:cs="Times New Roman" w:hint="eastAsia"/>
-          <w:sz w:val="24"/>
-          <w:lang w:eastAsia="zh-TW"/>
-        </w:rPr>
-        <w:t>車</w:t>
-      </w:r>
-    </w:p>
-    <w:p>
-      <w:pPr>
-        <w:spacing w:line="240" w:lineRule="auto"/>
-        <w:rPr>
-          <w:rFonts w:ascii="Times New Roman" w:eastAsia="PMingLiU" w:hAnsi="Times New Roman" w:cs="Times New Roman"/>
-          <w:sz w:val="24"/>
-          <w:lang w:eastAsia="zh-TW"/>
-        </w:rPr>
-      </w:pPr>
-      <w:r>
-        <w:rPr>
-          <w:rFonts w:ascii="Times New Roman" w:eastAsia="PMingLiU" w:hAnsi="Times New Roman" w:cs="Times New Roman" w:hint="eastAsia"/>
-          <w:sz w:val="24"/>
-          <w:lang w:eastAsia="zh-TW"/>
-        </w:rPr>
-        <w:t>麵包車駛入</w:t>
-      </w:r>
-      <w:r>
-        <w:rPr>
-          <w:rFonts w:ascii="Times New Roman" w:eastAsia="PMingLiU" w:hAnsi="Times New Roman" w:cs="Times New Roman" w:hint="eastAsia"/>
-          <w:strike/>
-          <w:sz w:val="24"/>
-          <w:lang w:eastAsia="zh-TW"/>
-        </w:rPr>
-        <w:t>(</w:t>
-      </w:r>
-      <w:r>
-        <w:rPr>
-          <w:rFonts w:ascii="Times New Roman" w:eastAsia="PMingLiU" w:hAnsi="Times New Roman" w:cs="Times New Roman" w:hint="eastAsia"/>
-          <w:strike/>
-          <w:sz w:val="24"/>
-          <w:lang w:eastAsia="zh-TW"/>
-        </w:rPr>
-        <w:t>飄移</w:t>
-      </w:r>
-      <w:r>
-        <w:rPr>
-          <w:rFonts w:ascii="Times New Roman" w:eastAsia="PMingLiU" w:hAnsi="Times New Roman" w:cs="Times New Roman"/>
-          <w:strike/>
-          <w:sz w:val="24"/>
-          <w:lang w:eastAsia="zh-TW"/>
-        </w:rPr>
-        <w:t>)</w:t>
-      </w:r>
-      <w:r>
-        <w:rPr>
-          <w:rFonts w:ascii="Times New Roman" w:eastAsia="PMingLiU" w:hAnsi="Times New Roman" w:cs="Times New Roman" w:hint="eastAsia"/>
-          <w:sz w:val="24"/>
-          <w:lang w:eastAsia="zh-TW"/>
-        </w:rPr>
-        <w:t>倉庫</w:t>
-      </w:r>
-      <w:r>
-        <w:rPr>
-          <w:rFonts w:ascii="Times New Roman" w:eastAsia="PMingLiU" w:hAnsi="Times New Roman" w:cs="Times New Roman" w:hint="eastAsia"/>
-          <w:sz w:val="24"/>
-          <w:lang w:eastAsia="zh-TW"/>
-        </w:rPr>
-        <w:t>，</w:t>
-      </w:r>
-      <w:r>
-        <w:rPr>
-          <w:rFonts w:ascii="Times New Roman" w:eastAsia="PMingLiU" w:hAnsi="Times New Roman" w:cs="Times New Roman" w:hint="eastAsia"/>
-          <w:sz w:val="24"/>
-          <w:lang w:eastAsia="zh-TW"/>
-        </w:rPr>
-        <w:t>兩位</w:t>
-      </w:r>
-      <w:r>
-        <w:rPr>
-          <w:rFonts w:ascii="Times New Roman" w:eastAsia="PMingLiU" w:hAnsi="Times New Roman" w:cs="Times New Roman" w:hint="eastAsia"/>
-          <w:sz w:val="24"/>
-          <w:lang w:eastAsia="zh-TW"/>
-        </w:rPr>
-        <w:t>穿</w:t>
-      </w:r>
-      <w:r>
-        <w:rPr>
-          <w:rFonts w:ascii="Times New Roman" w:eastAsia="PMingLiU" w:hAnsi="Times New Roman" w:cs="Times New Roman" w:hint="eastAsia"/>
-          <w:sz w:val="24"/>
-          <w:lang w:eastAsia="zh-TW"/>
-        </w:rPr>
-        <w:t>著工作服的員工從駕駛室下來，打開了麵包車的尾門。</w:t>
-      </w:r>
-    </w:p>
-    <w:p>
-      <w:pPr>
-        <w:spacing w:line="240" w:lineRule="auto"/>
-        <w:rPr>
-          <w:rFonts w:ascii="Times New Roman" w:eastAsia="PMingLiU" w:hAnsi="Times New Roman" w:cs="Times New Roman" w:hint="eastAsia"/>
-          <w:sz w:val="24"/>
-          <w:lang w:eastAsia="zh-TW"/>
-        </w:rPr>
-      </w:pPr>
-    </w:p>
-    <w:p>
-      <w:pPr>
-        <w:rPr>
-          <w:rFonts w:ascii="Times New Roman" w:eastAsia="PMingLiU" w:hAnsi="Times New Roman" w:cs="Times New Roman"/>
-          <w:sz w:val="24"/>
-          <w:lang w:eastAsia="zh-TW"/>
-        </w:rPr>
-      </w:pPr>
-      <w:r>
-        <w:rPr>
-          <w:rFonts w:ascii="Times New Roman" w:eastAsia="PMingLiU" w:hAnsi="Times New Roman" w:cs="Times New Roman"/>
-          <w:sz w:val="24"/>
-          <w:lang w:eastAsia="zh-TW"/>
-        </w:rPr>
-        <w:br w:type="page"/>
-      </w:r>
-    </w:p>
-    <w:p>
-      <w:pPr>
-        <w:spacing w:line="240" w:lineRule="auto"/>
-        <w:rPr>
-          <w:rFonts w:ascii="Times New Roman" w:eastAsia="PMingLiU" w:hAnsi="Times New Roman" w:cs="Times New Roman" w:hint="eastAsia"/>
-          <w:sz w:val="24"/>
-          <w:lang w:eastAsia="zh-TW"/>
-        </w:rPr>
-      </w:pPr>
-    </w:p>
-    <w:p>
-      <w:pPr>
-        <w:rPr>
-          <w:rFonts w:ascii="Times New Roman" w:eastAsia="PMingLiU" w:hAnsi="Times New Roman" w:cs="Times New Roman"/>
-          <w:sz w:val="24"/>
-          <w:lang w:eastAsia="zh-TW"/>
-        </w:rPr>
-      </w:pPr>
-      <w:r>
-        <w:rPr>
-          <w:rFonts w:ascii="Times New Roman" w:eastAsia="PMingLiU" w:hAnsi="Times New Roman" w:cs="Times New Roman"/>
-          <w:sz w:val="24"/>
-          <w:lang w:eastAsia="zh-TW"/>
-        </w:rPr>
-        <w:br w:type="page"/>
-      </w:r>
-    </w:p>
-    <w:p>
-      <w:pPr>
-        <w:spacing w:line="240" w:lineRule="auto"/>
-        <w:rPr>
-          <w:rFonts w:ascii="Times New Roman" w:eastAsia="PMingLiU" w:hAnsi="Times New Roman" w:cs="Times New Roman" w:hint="eastAsia"/>
           <w:sz w:val="24"/>
           <w:lang w:eastAsia="zh-TW"/>
         </w:rPr>
@@ -812,6 +792,7 @@
     <w:lsdException w:name="HTML Sample" w:semiHidden="1" w:unhideWhenUsed="1"/>
     <w:lsdException w:name="HTML Typewriter" w:semiHidden="1" w:unhideWhenUsed="1"/>
     <w:lsdException w:name="HTML Variable" w:semiHidden="1" w:unhideWhenUsed="1"/>
+    <w:lsdException w:name="Normal Table" w:semiHidden="1" w:unhideWhenUsed="1"/>
     <w:lsdException w:name="annotation subject" w:semiHidden="1" w:unhideWhenUsed="1"/>
     <w:lsdException w:name="No List" w:semiHidden="1" w:unhideWhenUsed="1"/>
     <w:lsdException w:name="Outline List 1" w:semiHidden="1" w:unhideWhenUsed="1"/>
@@ -858,8 +839,10 @@
     <w:lsdException w:name="Table Subtle 2" w:semiHidden="1" w:unhideWhenUsed="1"/>
     <w:lsdException w:name="Table Web 1" w:semiHidden="1" w:unhideWhenUsed="1"/>
     <w:lsdException w:name="Table Web 2" w:semiHidden="1" w:unhideWhenUsed="1"/>
+    <w:lsdException w:name="Table Web 3" w:semiHidden="1" w:unhideWhenUsed="1"/>
     <w:lsdException w:name="Balloon Text" w:semiHidden="1" w:unhideWhenUsed="1"/>
     <w:lsdException w:name="Table Grid" w:uiPriority="39"/>
+    <w:lsdException w:name="Table Theme" w:semiHidden="1" w:unhideWhenUsed="1"/>
     <w:lsdException w:name="Placeholder Text" w:semiHidden="1"/>
     <w:lsdException w:name="No Spacing" w:uiPriority="1" w:qFormat="1"/>
     <w:lsdException w:name="Light Shading" w:uiPriority="60"/>

</xml_diff>